<commit_message>
Restore filled CDE cover sheet as page 1 of the Second Review Report
Adds back the official CDE letterhead cover page (NAME, ROLL NO,
REG.NO, EMAIL-ID, title, guide info), filled in the same style as
the First Review Report's own cover page, ahead of the existing
plain-format content pages. Marks-table cells are left blank for
the Project Monitoring Committee to fill in. Corrected the email to
say.naresh135@gmail.com (the one actually used on the official First
Review Report) and filled in IV SEM - SET: 36 to match it.

Co-Authored-By: Claude Sonnet 5 <noreply@anthropic.com>
Claude-Session: https://claude.ai/code/session_01NtKqrpTuv6riB3qBRrfQW7
</commit_message>
<xml_diff>
--- a/Second-Review-Report.docx
+++ b/Second-Review-Report.docx
@@ -2,6 +2,1031 @@
 <file path=word/document.xml><?xml version="1.0" encoding="utf-8"?>
 <w:document xmlns:wpc="http://schemas.microsoft.com/office/word/2010/wordprocessingCanvas" xmlns:mc="http://schemas.openxmlformats.org/markup-compatibility/2006" xmlns:o="urn:schemas-microsoft-com:office:office" xmlns:r="http://schemas.openxmlformats.org/officeDocument/2006/relationships" xmlns:m="http://schemas.openxmlformats.org/officeDocument/2006/math" xmlns:v="urn:schemas-microsoft-com:vml" xmlns:wp14="http://schemas.microsoft.com/office/word/2010/wordprocessingDrawing" xmlns:wp="http://schemas.openxmlformats.org/drawingml/2006/wordprocessingDrawing" xmlns:w10="urn:schemas-microsoft-com:office:word" xmlns:w="http://schemas.openxmlformats.org/wordprocessingml/2006/main" xmlns:w14="http://schemas.microsoft.com/office/word/2010/wordml" xmlns:w15="http://schemas.microsoft.com/office/word/2012/wordml" xmlns:wpg="http://schemas.microsoft.com/office/word/2010/wordprocessingGroup" xmlns:wpi="http://schemas.microsoft.com/office/word/2010/wordprocessingInk" xmlns:wne="http://schemas.microsoft.com/office/word/2006/wordml" xmlns:wps="http://schemas.microsoft.com/office/word/2010/wordprocessingShape" xmlns:cx="http://schemas.microsoft.com/office/drawing/2014/chartex" xmlns:cx1="http://schemas.microsoft.com/office/drawing/2015/9/8/chartex" xmlns:cx2="http://schemas.microsoft.com/office/drawing/2015/10/21/chartex" xmlns:cx3="http://schemas.microsoft.com/office/drawing/2016/5/9/chartex" xmlns:cx4="http://schemas.microsoft.com/office/drawing/2016/5/10/chartex" xmlns:cx5="http://schemas.microsoft.com/office/drawing/2016/5/11/chartex" xmlns:cx6="http://schemas.microsoft.com/office/drawing/2016/5/12/chartex" xmlns:cx7="http://schemas.microsoft.com/office/drawing/2016/5/13/chartex" xmlns:cx8="http://schemas.microsoft.com/office/drawing/2016/5/14/chartex" xmlns:aink="http://schemas.microsoft.com/office/drawing/2016/ink" xmlns:am3d="http://schemas.microsoft.com/office/drawing/2017/model3d" xmlns:w16cex="http://schemas.microsoft.com/office/word/2018/wordml/cex" xmlns:w16cid="http://schemas.microsoft.com/office/word/2016/wordml/cid" xmlns:w16="http://schemas.microsoft.com/office/word/2018/wordml" xmlns:w16sdtdh="http://schemas.microsoft.com/office/word/2020/wordml/sdtdatahash" xmlns:w16se="http://schemas.microsoft.com/office/word/2015/wordml/symex" mc:Ignorable="w14 w15 wp14">
   <w:body>
+    <w:tbl>
+      <w:tblPr>
+        <w:tblW w:type="dxa" w:w="10240"/>
+        <w:tblBorders>
+          <w:top w:val="single" w:color="auto" w:sz="4"/>
+          <w:left w:val="single" w:color="auto" w:sz="4"/>
+          <w:bottom w:val="single" w:color="auto" w:sz="4"/>
+          <w:right w:val="single" w:color="auto" w:sz="4"/>
+          <w:insideH w:val="single" w:color="auto" w:sz="4"/>
+          <w:insideV w:val="single" w:color="auto" w:sz="4"/>
+        </w:tblBorders>
+      </w:tblPr>
+      <w:tblGrid>
+        <w:gridCol w:w="1600"/>
+        <w:gridCol w:w="6440"/>
+        <w:gridCol w:w="2200"/>
+      </w:tblGrid>
+      <w:tr>
+        <w:tc>
+          <w:tcPr>
+            <w:tcW w:type="dxa" w:w="1600"/>
+            <w:tcBorders>
+              <w:top w:val="single" w:color="000000" w:sz="2"/>
+              <w:left w:val="single" w:color="000000" w:sz="2"/>
+              <w:bottom w:val="single" w:color="000000" w:sz="2"/>
+              <w:right w:val="single" w:color="000000" w:sz="2"/>
+            </w:tcBorders>
+            <w:tcMar>
+              <w:top w:type="dxa" w:w="100"/>
+              <w:left w:type="dxa" w:w="100"/>
+              <w:bottom w:type="dxa" w:w="100"/>
+              <w:right w:type="dxa" w:w="100"/>
+            </w:tcMar>
+            <w:vAlign w:val="center"/>
+          </w:tcPr>
+          <w:p>
+            <w:pPr>
+              <w:jc w:val="center"/>
+            </w:pPr>
+            <w:r>
+              <w:drawing>
+                <wp:inline distT="0" distB="0" distL="0" distR="0">
+                  <wp:extent cx="571500" cy="571500"/>
+                  <wp:effectExtent t="0" r="0" b="0" l="0"/>
+                  <wp:docPr id="1" name="" descr="" title=""/>
+                  <wp:cNvGraphicFramePr>
+                    <a:graphicFrameLocks xmlns:a="http://schemas.openxmlformats.org/drawingml/2006/main" noChangeAspect="1"/>
+                  </wp:cNvGraphicFramePr>
+                  <a:graphic xmlns:a="http://schemas.openxmlformats.org/drawingml/2006/main">
+                    <a:graphicData uri="http://schemas.openxmlformats.org/drawingml/2006/picture">
+                      <pic:pic xmlns:pic="http://schemas.openxmlformats.org/drawingml/2006/picture">
+                        <pic:nvPicPr>
+                          <pic:cNvPr id="0" name="" descr=""/>
+                          <pic:cNvPicPr>
+                            <a:picLocks noChangeAspect="1" noChangeArrowheads="1"/>
+                          </pic:cNvPicPr>
+                        </pic:nvPicPr>
+                        <pic:blipFill>
+                          <a:blip r:embed="rId7" cstate="none"/>
+                          <a:srcRect/>
+                          <a:stretch>
+                            <a:fillRect/>
+                          </a:stretch>
+                        </pic:blipFill>
+                        <pic:spPr bwMode="auto">
+                          <a:xfrm>
+                            <a:off x="0" y="0"/>
+                            <a:ext cx="571500" cy="571500"/>
+                          </a:xfrm>
+                          <a:prstGeom prst="rect">
+                            <a:avLst/>
+                          </a:prstGeom>
+                        </pic:spPr>
+                      </pic:pic>
+                    </a:graphicData>
+                  </a:graphic>
+                </wp:inline>
+              </w:drawing>
+            </w:r>
+          </w:p>
+        </w:tc>
+        <w:tc>
+          <w:tcPr>
+            <w:tcW w:type="dxa" w:w="6440"/>
+            <w:tcBorders>
+              <w:top w:val="single" w:color="000000" w:sz="2"/>
+              <w:left w:val="single" w:color="000000" w:sz="2"/>
+              <w:bottom w:val="single" w:color="000000" w:sz="2"/>
+              <w:right w:val="single" w:color="000000" w:sz="2"/>
+            </w:tcBorders>
+            <w:tcMar>
+              <w:top w:type="dxa" w:w="100"/>
+              <w:left w:type="dxa" w:w="100"/>
+              <w:bottom w:type="dxa" w:w="100"/>
+              <w:right w:type="dxa" w:w="100"/>
+            </w:tcMar>
+            <w:vAlign w:val="center"/>
+          </w:tcPr>
+          <w:p>
+            <w:pPr>
+              <w:jc w:val="center"/>
+            </w:pPr>
+            <w:r>
+              <w:rPr>
+                <w:b/>
+                <w:bCs/>
+                <w:sz w:val="24"/>
+                <w:szCs w:val="24"/>
+              </w:rPr>
+              <w:t xml:space="preserve">CENTRE FOR DISTANCE EDUCATION</w:t>
+            </w:r>
+          </w:p>
+          <w:p>
+            <w:pPr>
+              <w:jc w:val="center"/>
+            </w:pPr>
+            <w:r>
+              <w:rPr>
+                <w:b/>
+                <w:bCs/>
+                <w:sz w:val="24"/>
+                <w:szCs w:val="24"/>
+              </w:rPr>
+              <w:t xml:space="preserve">ANNA UNIVERSITY</w:t>
+            </w:r>
+          </w:p>
+          <w:p>
+            <w:pPr>
+              <w:jc w:val="center"/>
+            </w:pPr>
+            <w:r>
+              <w:rPr>
+                <w:b/>
+                <w:bCs/>
+                <w:sz w:val="24"/>
+                <w:szCs w:val="24"/>
+              </w:rPr>
+              <w:t xml:space="preserve">CHENNAI - 600 025</w:t>
+            </w:r>
+          </w:p>
+        </w:tc>
+        <w:tc>
+          <w:tcPr>
+            <w:tcW w:type="dxa" w:w="2200"/>
+            <w:tcBorders>
+              <w:top w:val="single" w:color="000000" w:sz="2"/>
+              <w:left w:val="single" w:color="000000" w:sz="2"/>
+              <w:bottom w:val="single" w:color="000000" w:sz="2"/>
+              <w:right w:val="single" w:color="000000" w:sz="2"/>
+            </w:tcBorders>
+            <w:tcMar>
+              <w:top w:type="dxa" w:w="100"/>
+              <w:left w:type="dxa" w:w="100"/>
+              <w:bottom w:type="dxa" w:w="100"/>
+              <w:right w:type="dxa" w:w="100"/>
+            </w:tcMar>
+          </w:tcPr>
+          <w:p>
+            <w:r>
+              <w:rPr>
+                <w:sz w:val="18"/>
+                <w:szCs w:val="18"/>
+              </w:rPr>
+              <w:t xml:space="preserve">Office: 2235 7222</w:t>
+            </w:r>
+          </w:p>
+          <w:p>
+            <w:r>
+              <w:rPr>
+                <w:sz w:val="18"/>
+                <w:szCs w:val="18"/>
+              </w:rPr>
+              <w:t xml:space="preserve">E-mail: cdestudycentre@gmail.com</w:t>
+            </w:r>
+          </w:p>
+        </w:tc>
+      </w:tr>
+    </w:tbl>
+    <w:p>
+      <w:pPr>
+        <w:spacing w:before="240"/>
+      </w:pPr>
+      <w:r>
+        <w:rPr>
+          <w:b/>
+          <w:bCs/>
+          <w:sz w:val="22"/>
+          <w:szCs w:val="22"/>
+        </w:rPr>
+        <w:t xml:space="preserve">D123 - CDE Study Centre</w:t>
+      </w:r>
+      <w:r>
+        <w:rPr>
+          <w:b/>
+          <w:bCs/>
+          <w:sz w:val="22"/>
+          <w:szCs w:val="22"/>
+        </w:rPr>
+        <w:t xml:space="preserve">					Programme : MCA</w:t>
+      </w:r>
+    </w:p>
+    <w:p>
+      <w:pPr>
+        <w:spacing w:after="200" w:before="120"/>
+      </w:pPr>
+      <w:r>
+        <w:rPr>
+          <w:b/>
+          <w:bCs/>
+          <w:sz w:val="22"/>
+          <w:szCs w:val="22"/>
+        </w:rPr>
+        <w:t xml:space="preserve">IV SEM – SET : 36</w:t>
+      </w:r>
+    </w:p>
+    <w:p>
+      <w:pPr>
+        <w:pBdr>
+          <w:bottom w:val="single" w:color="000000" w:sz="6"/>
+        </w:pBdr>
+        <w:spacing w:after="200"/>
+        <w:jc w:val="center"/>
+      </w:pPr>
+      <w:r>
+        <w:rPr>
+          <w:b/>
+          <w:bCs/>
+          <w:sz w:val="26"/>
+          <w:szCs w:val="26"/>
+          <w:u w:val="single"/>
+        </w:rPr>
+        <w:t xml:space="preserve">SECOND REVIEW REPORT</w:t>
+      </w:r>
+    </w:p>
+    <w:tbl>
+      <w:tblPr>
+        <w:tblW w:type="dxa" w:w="10240"/>
+        <w:tblBorders>
+          <w:top w:val="single" w:color="auto" w:sz="4"/>
+          <w:left w:val="single" w:color="auto" w:sz="4"/>
+          <w:bottom w:val="single" w:color="auto" w:sz="4"/>
+          <w:right w:val="single" w:color="auto" w:sz="4"/>
+          <w:insideH w:val="single" w:color="auto" w:sz="4"/>
+          <w:insideV w:val="single" w:color="auto" w:sz="4"/>
+        </w:tblBorders>
+      </w:tblPr>
+      <w:tblGrid>
+        <w:gridCol w:w="2600"/>
+        <w:gridCol w:w="7640"/>
+      </w:tblGrid>
+      <w:tr>
+        <w:tc>
+          <w:tcPr>
+            <w:tcW w:type="dxa" w:w="2600"/>
+            <w:tcBorders>
+              <w:top w:val="single" w:color="000000" w:sz="2"/>
+              <w:left w:val="single" w:color="000000" w:sz="2"/>
+              <w:bottom w:val="single" w:color="000000" w:sz="2"/>
+              <w:right w:val="single" w:color="000000" w:sz="2"/>
+            </w:tcBorders>
+            <w:tcMar>
+              <w:top w:type="dxa" w:w="100"/>
+              <w:left w:type="dxa" w:w="120"/>
+              <w:bottom w:type="dxa" w:w="100"/>
+              <w:right w:type="dxa" w:w="120"/>
+            </w:tcMar>
+          </w:tcPr>
+          <w:p>
+            <w:r>
+              <w:rPr>
+                <w:b/>
+                <w:bCs/>
+                <w:sz w:val="22"/>
+                <w:szCs w:val="22"/>
+              </w:rPr>
+              <w:t xml:space="preserve">NAME</w:t>
+            </w:r>
+          </w:p>
+        </w:tc>
+        <w:tc>
+          <w:tcPr>
+            <w:tcW w:type="dxa" w:w="7640"/>
+            <w:tcBorders>
+              <w:top w:val="single" w:color="000000" w:sz="2"/>
+              <w:left w:val="single" w:color="000000" w:sz="2"/>
+              <w:bottom w:val="single" w:color="000000" w:sz="2"/>
+              <w:right w:val="single" w:color="000000" w:sz="2"/>
+            </w:tcBorders>
+            <w:tcMar>
+              <w:top w:type="dxa" w:w="100"/>
+              <w:left w:type="dxa" w:w="120"/>
+              <w:bottom w:type="dxa" w:w="100"/>
+              <w:right w:type="dxa" w:w="120"/>
+            </w:tcMar>
+          </w:tcPr>
+          <w:p>
+            <w:r>
+              <w:rPr>
+                <w:sz w:val="22"/>
+                <w:szCs w:val="22"/>
+              </w:rPr>
+              <w:t xml:space="preserve">Naresh S</w:t>
+            </w:r>
+          </w:p>
+        </w:tc>
+      </w:tr>
+      <w:tr>
+        <w:tc>
+          <w:tcPr>
+            <w:tcW w:type="dxa" w:w="2600"/>
+            <w:tcBorders>
+              <w:top w:val="single" w:color="000000" w:sz="2"/>
+              <w:left w:val="single" w:color="000000" w:sz="2"/>
+              <w:bottom w:val="single" w:color="000000" w:sz="2"/>
+              <w:right w:val="single" w:color="000000" w:sz="2"/>
+            </w:tcBorders>
+            <w:tcMar>
+              <w:top w:type="dxa" w:w="100"/>
+              <w:left w:type="dxa" w:w="120"/>
+              <w:bottom w:type="dxa" w:w="100"/>
+              <w:right w:type="dxa" w:w="120"/>
+            </w:tcMar>
+          </w:tcPr>
+          <w:p>
+            <w:r>
+              <w:rPr>
+                <w:b/>
+                <w:bCs/>
+                <w:sz w:val="22"/>
+                <w:szCs w:val="22"/>
+              </w:rPr>
+              <w:t xml:space="preserve">ROLL NO</w:t>
+            </w:r>
+          </w:p>
+        </w:tc>
+        <w:tc>
+          <w:tcPr>
+            <w:tcW w:type="dxa" w:w="7640"/>
+            <w:tcBorders>
+              <w:top w:val="single" w:color="000000" w:sz="2"/>
+              <w:left w:val="single" w:color="000000" w:sz="2"/>
+              <w:bottom w:val="single" w:color="000000" w:sz="2"/>
+              <w:right w:val="single" w:color="000000" w:sz="2"/>
+            </w:tcBorders>
+            <w:tcMar>
+              <w:top w:type="dxa" w:w="100"/>
+              <w:left w:type="dxa" w:w="120"/>
+              <w:bottom w:type="dxa" w:w="100"/>
+              <w:right w:type="dxa" w:w="120"/>
+            </w:tcMar>
+          </w:tcPr>
+          <w:p>
+            <w:r>
+              <w:rPr>
+                <w:sz w:val="22"/>
+                <w:szCs w:val="22"/>
+              </w:rPr>
+              <w:t xml:space="preserve">2436MCA0047</w:t>
+            </w:r>
+          </w:p>
+        </w:tc>
+      </w:tr>
+      <w:tr>
+        <w:tc>
+          <w:tcPr>
+            <w:tcW w:type="dxa" w:w="2600"/>
+            <w:tcBorders>
+              <w:top w:val="single" w:color="000000" w:sz="2"/>
+              <w:left w:val="single" w:color="000000" w:sz="2"/>
+              <w:bottom w:val="single" w:color="000000" w:sz="2"/>
+              <w:right w:val="single" w:color="000000" w:sz="2"/>
+            </w:tcBorders>
+            <w:tcMar>
+              <w:top w:type="dxa" w:w="100"/>
+              <w:left w:type="dxa" w:w="120"/>
+              <w:bottom w:type="dxa" w:w="100"/>
+              <w:right w:type="dxa" w:w="120"/>
+            </w:tcMar>
+          </w:tcPr>
+          <w:p>
+            <w:r>
+              <w:rPr>
+                <w:b/>
+                <w:bCs/>
+                <w:sz w:val="22"/>
+                <w:szCs w:val="22"/>
+              </w:rPr>
+              <w:t xml:space="preserve">REG.NO</w:t>
+            </w:r>
+          </w:p>
+        </w:tc>
+        <w:tc>
+          <w:tcPr>
+            <w:tcW w:type="dxa" w:w="7640"/>
+            <w:tcBorders>
+              <w:top w:val="single" w:color="000000" w:sz="2"/>
+              <w:left w:val="single" w:color="000000" w:sz="2"/>
+              <w:bottom w:val="single" w:color="000000" w:sz="2"/>
+              <w:right w:val="single" w:color="000000" w:sz="2"/>
+            </w:tcBorders>
+            <w:tcMar>
+              <w:top w:type="dxa" w:w="100"/>
+              <w:left w:type="dxa" w:w="120"/>
+              <w:bottom w:type="dxa" w:w="100"/>
+              <w:right w:type="dxa" w:w="120"/>
+            </w:tcMar>
+          </w:tcPr>
+          <w:p>
+            <w:r>
+              <w:rPr>
+                <w:sz w:val="22"/>
+                <w:szCs w:val="22"/>
+              </w:rPr>
+              <w:t xml:space="preserve">67224200080</w:t>
+            </w:r>
+          </w:p>
+        </w:tc>
+      </w:tr>
+      <w:tr>
+        <w:tc>
+          <w:tcPr>
+            <w:tcW w:type="dxa" w:w="2600"/>
+            <w:tcBorders>
+              <w:top w:val="single" w:color="000000" w:sz="2"/>
+              <w:left w:val="single" w:color="000000" w:sz="2"/>
+              <w:bottom w:val="single" w:color="000000" w:sz="2"/>
+              <w:right w:val="single" w:color="000000" w:sz="2"/>
+            </w:tcBorders>
+            <w:tcMar>
+              <w:top w:type="dxa" w:w="100"/>
+              <w:left w:type="dxa" w:w="120"/>
+              <w:bottom w:type="dxa" w:w="100"/>
+              <w:right w:type="dxa" w:w="120"/>
+            </w:tcMar>
+          </w:tcPr>
+          <w:p>
+            <w:r>
+              <w:rPr>
+                <w:b/>
+                <w:bCs/>
+                <w:sz w:val="22"/>
+                <w:szCs w:val="22"/>
+              </w:rPr>
+              <w:t xml:space="preserve">EMAIL-ID</w:t>
+            </w:r>
+          </w:p>
+        </w:tc>
+        <w:tc>
+          <w:tcPr>
+            <w:tcW w:type="dxa" w:w="7640"/>
+            <w:tcBorders>
+              <w:top w:val="single" w:color="000000" w:sz="2"/>
+              <w:left w:val="single" w:color="000000" w:sz="2"/>
+              <w:bottom w:val="single" w:color="000000" w:sz="2"/>
+              <w:right w:val="single" w:color="000000" w:sz="2"/>
+            </w:tcBorders>
+            <w:tcMar>
+              <w:top w:type="dxa" w:w="100"/>
+              <w:left w:type="dxa" w:w="120"/>
+              <w:bottom w:type="dxa" w:w="100"/>
+              <w:right w:type="dxa" w:w="120"/>
+            </w:tcMar>
+          </w:tcPr>
+          <w:p>
+            <w:r>
+              <w:rPr>
+                <w:sz w:val="22"/>
+                <w:szCs w:val="22"/>
+              </w:rPr>
+              <w:t xml:space="preserve">say.naresh135@gmail.com</w:t>
+            </w:r>
+          </w:p>
+        </w:tc>
+      </w:tr>
+    </w:tbl>
+    <w:p>
+      <w:pPr>
+        <w:spacing w:after="80" w:before="240"/>
+      </w:pPr>
+      <w:r>
+        <w:rPr>
+          <w:b/>
+          <w:bCs/>
+          <w:sz w:val="22"/>
+          <w:szCs w:val="22"/>
+        </w:rPr>
+        <w:t xml:space="preserve">TITLE OF THE PROJECT:</w:t>
+      </w:r>
+    </w:p>
+    <w:p>
+      <w:pPr>
+        <w:spacing w:after="300"/>
+      </w:pPr>
+      <w:r>
+        <w:rPr>
+          <w:sz w:val="22"/>
+          <w:szCs w:val="22"/>
+        </w:rPr>
+        <w:t xml:space="preserve">Automated AI-Driven Loan Underwriting &amp; Document Fraud Detection System</w:t>
+      </w:r>
+    </w:p>
+    <w:p>
+      <w:pPr>
+        <w:spacing w:after="100" w:before="400"/>
+      </w:pPr>
+      <w:r>
+        <w:rPr>
+          <w:i/>
+          <w:iCs/>
+          <w:sz w:val="22"/>
+          <w:szCs w:val="22"/>
+        </w:rPr>
+        <w:t xml:space="preserve">Signature of the Guide:				</w:t>
+      </w:r>
+      <w:r>
+        <w:rPr>
+          <w:sz w:val="22"/>
+          <w:szCs w:val="22"/>
+        </w:rPr>
+        <w:t xml:space="preserve">Guide Name and Designation: Institution:</w:t>
+      </w:r>
+    </w:p>
+    <w:p>
+      <w:pPr>
+        <w:spacing w:after="200" w:before="60"/>
+        <w:ind w:left="4752"/>
+      </w:pPr>
+      <w:r>
+        <w:rPr>
+          <w:sz w:val="21"/>
+          <w:szCs w:val="21"/>
+        </w:rPr>
+        <w:t xml:space="preserve">Dr. R. Baskaran, Professor</w:t>
+      </w:r>
+    </w:p>
+    <w:p>
+      <w:pPr>
+        <w:ind w:left="4752"/>
+      </w:pPr>
+      <w:r>
+        <w:rPr>
+          <w:sz w:val="21"/>
+          <w:szCs w:val="21"/>
+        </w:rPr>
+        <w:t xml:space="preserve">Dept. of CSE, CEG Campus, Anna University, Chennai - 25</w:t>
+      </w:r>
+    </w:p>
+    <w:p>
+      <w:pPr>
+        <w:pBdr>
+          <w:top w:val="single" w:color="000000" w:sz="6"/>
+        </w:pBdr>
+        <w:spacing w:after="160" w:before="300"/>
+      </w:pPr>
+      <w:r>
+        <w:rPr>
+          <w:b/>
+          <w:bCs/>
+          <w:sz w:val="22"/>
+          <w:szCs w:val="22"/>
+        </w:rPr>
+        <w:t xml:space="preserve">REMARKS (by Project Monitoring Committee)</w:t>
+      </w:r>
+    </w:p>
+    <w:p>
+      <w:pPr>
+        <w:pBdr>
+          <w:bottom w:val="single" w:color="808080" w:sz="4"/>
+        </w:pBdr>
+        <w:spacing w:after="100"/>
+      </w:pPr>
+      <w:r>
+        <w:rPr>
+          <w:sz w:val="22"/>
+          <w:szCs w:val="22"/>
+        </w:rPr>
+        <w:t xml:space="preserve"> </w:t>
+      </w:r>
+    </w:p>
+    <w:p>
+      <w:pPr>
+        <w:pBdr>
+          <w:bottom w:val="single" w:color="808080" w:sz="4"/>
+        </w:pBdr>
+        <w:spacing w:after="100"/>
+      </w:pPr>
+      <w:r>
+        <w:rPr>
+          <w:sz w:val="22"/>
+          <w:szCs w:val="22"/>
+        </w:rPr>
+        <w:t xml:space="preserve"> </w:t>
+      </w:r>
+    </w:p>
+    <w:p>
+      <w:pPr>
+        <w:pBdr>
+          <w:bottom w:val="single" w:color="808080" w:sz="4"/>
+        </w:pBdr>
+        <w:spacing w:after="300"/>
+      </w:pPr>
+      <w:r>
+        <w:rPr>
+          <w:sz w:val="22"/>
+          <w:szCs w:val="22"/>
+        </w:rPr>
+        <w:t xml:space="preserve"> </w:t>
+      </w:r>
+    </w:p>
+    <w:p>
+      <w:pPr>
+        <w:spacing w:after="200" w:before="300"/>
+        <w:jc w:val="center"/>
+      </w:pPr>
+      <w:r>
+        <w:rPr>
+          <w:b/>
+          <w:bCs/>
+          <w:sz w:val="22"/>
+          <w:szCs w:val="22"/>
+          <w:u w:val="single"/>
+        </w:rPr>
+        <w:t xml:space="preserve">RECOMMENDED / NOT RECOMMENDED TO PROCEED WITH THE PROJECT</w:t>
+      </w:r>
+    </w:p>
+    <w:tbl>
+      <w:tblPr>
+        <w:tblW w:type="dxa" w:w="10240"/>
+        <w:tblBorders>
+          <w:top w:val="single" w:color="auto" w:sz="4"/>
+          <w:left w:val="single" w:color="auto" w:sz="4"/>
+          <w:bottom w:val="single" w:color="auto" w:sz="4"/>
+          <w:right w:val="single" w:color="auto" w:sz="4"/>
+          <w:insideH w:val="single" w:color="auto" w:sz="4"/>
+          <w:insideV w:val="single" w:color="auto" w:sz="4"/>
+        </w:tblBorders>
+      </w:tblPr>
+      <w:tblGrid>
+        <w:gridCol w:w="1607"/>
+        <w:gridCol w:w="1607"/>
+        <w:gridCol w:w="1607"/>
+        <w:gridCol w:w="1607"/>
+        <w:gridCol w:w="1607"/>
+        <w:gridCol w:w="1607"/>
+      </w:tblGrid>
+      <w:tr>
+        <w:tc>
+          <w:tcPr>
+            <w:tcW w:type="dxa" w:w="1607"/>
+            <w:tcBorders>
+              <w:top w:val="single" w:color="000000" w:sz="2"/>
+              <w:left w:val="single" w:color="000000" w:sz="2"/>
+              <w:bottom w:val="single" w:color="000000" w:sz="2"/>
+              <w:right w:val="single" w:color="000000" w:sz="2"/>
+            </w:tcBorders>
+            <w:tcMar>
+              <w:top w:type="dxa" w:w="80"/>
+              <w:left w:type="dxa" w:w="80"/>
+              <w:bottom w:type="dxa" w:w="80"/>
+              <w:right w:type="dxa" w:w="80"/>
+            </w:tcMar>
+          </w:tcPr>
+          <w:p>
+            <w:pPr>
+              <w:jc w:val="center"/>
+            </w:pPr>
+            <w:r>
+              <w:rPr>
+                <w:b/>
+                <w:bCs/>
+                <w:sz w:val="19"/>
+                <w:szCs w:val="19"/>
+              </w:rPr>
+              <w:t xml:space="preserve">System Design : 4</w:t>
+            </w:r>
+          </w:p>
+        </w:tc>
+        <w:tc>
+          <w:tcPr>
+            <w:tcW w:type="dxa" w:w="1607"/>
+            <w:tcBorders>
+              <w:top w:val="single" w:color="000000" w:sz="2"/>
+              <w:left w:val="single" w:color="000000" w:sz="2"/>
+              <w:bottom w:val="single" w:color="000000" w:sz="2"/>
+              <w:right w:val="single" w:color="000000" w:sz="2"/>
+            </w:tcBorders>
+            <w:tcMar>
+              <w:top w:type="dxa" w:w="80"/>
+              <w:left w:type="dxa" w:w="80"/>
+              <w:bottom w:type="dxa" w:w="80"/>
+              <w:right w:type="dxa" w:w="80"/>
+            </w:tcMar>
+          </w:tcPr>
+          <w:p>
+            <w:pPr>
+              <w:jc w:val="center"/>
+            </w:pPr>
+            <w:r>
+              <w:rPr>
+                <w:b/>
+                <w:bCs/>
+                <w:sz w:val="19"/>
+                <w:szCs w:val="19"/>
+              </w:rPr>
+              <w:t xml:space="preserve">Data Set : 6</w:t>
+            </w:r>
+          </w:p>
+        </w:tc>
+        <w:tc>
+          <w:tcPr>
+            <w:tcW w:type="dxa" w:w="1607"/>
+            <w:tcBorders>
+              <w:top w:val="single" w:color="000000" w:sz="2"/>
+              <w:left w:val="single" w:color="000000" w:sz="2"/>
+              <w:bottom w:val="single" w:color="000000" w:sz="2"/>
+              <w:right w:val="single" w:color="000000" w:sz="2"/>
+            </w:tcBorders>
+            <w:tcMar>
+              <w:top w:type="dxa" w:w="80"/>
+              <w:left w:type="dxa" w:w="80"/>
+              <w:bottom w:type="dxa" w:w="80"/>
+              <w:right w:type="dxa" w:w="80"/>
+            </w:tcMar>
+          </w:tcPr>
+          <w:p>
+            <w:pPr>
+              <w:jc w:val="center"/>
+            </w:pPr>
+            <w:r>
+              <w:rPr>
+                <w:b/>
+                <w:bCs/>
+                <w:sz w:val="19"/>
+                <w:szCs w:val="19"/>
+              </w:rPr>
+              <w:t xml:space="preserve">Modules Completed : 14</w:t>
+            </w:r>
+          </w:p>
+        </w:tc>
+        <w:tc>
+          <w:tcPr>
+            <w:tcW w:type="dxa" w:w="1607"/>
+            <w:tcBorders>
+              <w:top w:val="single" w:color="000000" w:sz="2"/>
+              <w:left w:val="single" w:color="000000" w:sz="2"/>
+              <w:bottom w:val="single" w:color="000000" w:sz="2"/>
+              <w:right w:val="single" w:color="000000" w:sz="2"/>
+            </w:tcBorders>
+            <w:tcMar>
+              <w:top w:type="dxa" w:w="80"/>
+              <w:left w:type="dxa" w:w="80"/>
+              <w:bottom w:type="dxa" w:w="80"/>
+              <w:right w:type="dxa" w:w="80"/>
+            </w:tcMar>
+          </w:tcPr>
+          <w:p>
+            <w:pPr>
+              <w:jc w:val="center"/>
+            </w:pPr>
+            <w:r>
+              <w:rPr>
+                <w:b/>
+                <w:bCs/>
+                <w:sz w:val="19"/>
+                <w:szCs w:val="19"/>
+              </w:rPr>
+              <w:t xml:space="preserve">Pseudo code : 2</w:t>
+            </w:r>
+          </w:p>
+        </w:tc>
+        <w:tc>
+          <w:tcPr>
+            <w:tcW w:type="dxa" w:w="1607"/>
+            <w:tcBorders>
+              <w:top w:val="single" w:color="000000" w:sz="2"/>
+              <w:left w:val="single" w:color="000000" w:sz="2"/>
+              <w:bottom w:val="single" w:color="000000" w:sz="2"/>
+              <w:right w:val="single" w:color="000000" w:sz="2"/>
+            </w:tcBorders>
+            <w:tcMar>
+              <w:top w:type="dxa" w:w="80"/>
+              <w:left w:type="dxa" w:w="80"/>
+              <w:bottom w:type="dxa" w:w="80"/>
+              <w:right w:type="dxa" w:w="80"/>
+            </w:tcMar>
+          </w:tcPr>
+          <w:p>
+            <w:pPr>
+              <w:jc w:val="center"/>
+            </w:pPr>
+            <w:r>
+              <w:rPr>
+                <w:b/>
+                <w:bCs/>
+                <w:sz w:val="19"/>
+                <w:szCs w:val="19"/>
+              </w:rPr>
+              <w:t xml:space="preserve">Contribution : 4</w:t>
+            </w:r>
+          </w:p>
+        </w:tc>
+        <w:tc>
+          <w:tcPr>
+            <w:tcW w:type="dxa" w:w="1607"/>
+            <w:tcBorders>
+              <w:top w:val="single" w:color="000000" w:sz="2"/>
+              <w:left w:val="single" w:color="000000" w:sz="2"/>
+              <w:bottom w:val="single" w:color="000000" w:sz="2"/>
+              <w:right w:val="single" w:color="000000" w:sz="2"/>
+            </w:tcBorders>
+            <w:tcMar>
+              <w:top w:type="dxa" w:w="80"/>
+              <w:left w:type="dxa" w:w="80"/>
+              <w:bottom w:type="dxa" w:w="80"/>
+              <w:right w:type="dxa" w:w="80"/>
+            </w:tcMar>
+          </w:tcPr>
+          <w:p>
+            <w:pPr>
+              <w:jc w:val="center"/>
+            </w:pPr>
+            <w:r>
+              <w:rPr>
+                <w:b/>
+                <w:bCs/>
+                <w:sz w:val="19"/>
+                <w:szCs w:val="19"/>
+              </w:rPr>
+              <w:t xml:space="preserve">Total : 30 Marks</w:t>
+            </w:r>
+          </w:p>
+        </w:tc>
+      </w:tr>
+      <w:tr>
+        <w:tc>
+          <w:tcPr>
+            <w:tcW w:type="dxa" w:w="1607"/>
+            <w:tcBorders>
+              <w:top w:val="single" w:color="000000" w:sz="2"/>
+              <w:left w:val="single" w:color="000000" w:sz="2"/>
+              <w:bottom w:val="single" w:color="000000" w:sz="2"/>
+              <w:right w:val="single" w:color="000000" w:sz="2"/>
+            </w:tcBorders>
+            <w:tcMar>
+              <w:top w:type="dxa" w:w="300"/>
+              <w:left w:type="dxa" w:w="80"/>
+              <w:bottom w:type="dxa" w:w="300"/>
+              <w:right w:type="dxa" w:w="80"/>
+            </w:tcMar>
+          </w:tcPr>
+          <w:p>
+            <w:r>
+              <w:rPr>
+                <w:sz w:val="20"/>
+                <w:szCs w:val="20"/>
+              </w:rPr>
+              <w:t xml:space="preserve"> </w:t>
+            </w:r>
+          </w:p>
+        </w:tc>
+        <w:tc>
+          <w:tcPr>
+            <w:tcW w:type="dxa" w:w="1607"/>
+            <w:tcBorders>
+              <w:top w:val="single" w:color="000000" w:sz="2"/>
+              <w:left w:val="single" w:color="000000" w:sz="2"/>
+              <w:bottom w:val="single" w:color="000000" w:sz="2"/>
+              <w:right w:val="single" w:color="000000" w:sz="2"/>
+            </w:tcBorders>
+            <w:tcMar>
+              <w:top w:type="dxa" w:w="300"/>
+              <w:left w:type="dxa" w:w="80"/>
+              <w:bottom w:type="dxa" w:w="300"/>
+              <w:right w:type="dxa" w:w="80"/>
+            </w:tcMar>
+          </w:tcPr>
+          <w:p>
+            <w:r>
+              <w:rPr>
+                <w:sz w:val="20"/>
+                <w:szCs w:val="20"/>
+              </w:rPr>
+              <w:t xml:space="preserve"> </w:t>
+            </w:r>
+          </w:p>
+        </w:tc>
+        <w:tc>
+          <w:tcPr>
+            <w:tcW w:type="dxa" w:w="1607"/>
+            <w:tcBorders>
+              <w:top w:val="single" w:color="000000" w:sz="2"/>
+              <w:left w:val="single" w:color="000000" w:sz="2"/>
+              <w:bottom w:val="single" w:color="000000" w:sz="2"/>
+              <w:right w:val="single" w:color="000000" w:sz="2"/>
+            </w:tcBorders>
+            <w:tcMar>
+              <w:top w:type="dxa" w:w="300"/>
+              <w:left w:type="dxa" w:w="80"/>
+              <w:bottom w:type="dxa" w:w="300"/>
+              <w:right w:type="dxa" w:w="80"/>
+            </w:tcMar>
+          </w:tcPr>
+          <w:p>
+            <w:r>
+              <w:rPr>
+                <w:sz w:val="20"/>
+                <w:szCs w:val="20"/>
+              </w:rPr>
+              <w:t xml:space="preserve"> </w:t>
+            </w:r>
+          </w:p>
+        </w:tc>
+        <w:tc>
+          <w:tcPr>
+            <w:tcW w:type="dxa" w:w="1607"/>
+            <w:tcBorders>
+              <w:top w:val="single" w:color="000000" w:sz="2"/>
+              <w:left w:val="single" w:color="000000" w:sz="2"/>
+              <w:bottom w:val="single" w:color="000000" w:sz="2"/>
+              <w:right w:val="single" w:color="000000" w:sz="2"/>
+            </w:tcBorders>
+            <w:tcMar>
+              <w:top w:type="dxa" w:w="300"/>
+              <w:left w:type="dxa" w:w="80"/>
+              <w:bottom w:type="dxa" w:w="300"/>
+              <w:right w:type="dxa" w:w="80"/>
+            </w:tcMar>
+          </w:tcPr>
+          <w:p>
+            <w:r>
+              <w:rPr>
+                <w:sz w:val="20"/>
+                <w:szCs w:val="20"/>
+              </w:rPr>
+              <w:t xml:space="preserve"> </w:t>
+            </w:r>
+          </w:p>
+        </w:tc>
+        <w:tc>
+          <w:tcPr>
+            <w:tcW w:type="dxa" w:w="1607"/>
+            <w:tcBorders>
+              <w:top w:val="single" w:color="000000" w:sz="2"/>
+              <w:left w:val="single" w:color="000000" w:sz="2"/>
+              <w:bottom w:val="single" w:color="000000" w:sz="2"/>
+              <w:right w:val="single" w:color="000000" w:sz="2"/>
+            </w:tcBorders>
+            <w:tcMar>
+              <w:top w:type="dxa" w:w="300"/>
+              <w:left w:type="dxa" w:w="80"/>
+              <w:bottom w:type="dxa" w:w="300"/>
+              <w:right w:type="dxa" w:w="80"/>
+            </w:tcMar>
+          </w:tcPr>
+          <w:p>
+            <w:r>
+              <w:rPr>
+                <w:sz w:val="20"/>
+                <w:szCs w:val="20"/>
+              </w:rPr>
+              <w:t xml:space="preserve"> </w:t>
+            </w:r>
+          </w:p>
+        </w:tc>
+        <w:tc>
+          <w:tcPr>
+            <w:tcW w:type="dxa" w:w="1607"/>
+            <w:tcBorders>
+              <w:top w:val="single" w:color="000000" w:sz="2"/>
+              <w:left w:val="single" w:color="000000" w:sz="2"/>
+              <w:bottom w:val="single" w:color="000000" w:sz="2"/>
+              <w:right w:val="single" w:color="000000" w:sz="2"/>
+            </w:tcBorders>
+            <w:tcMar>
+              <w:top w:type="dxa" w:w="300"/>
+              <w:left w:type="dxa" w:w="80"/>
+              <w:bottom w:type="dxa" w:w="300"/>
+              <w:right w:type="dxa" w:w="80"/>
+            </w:tcMar>
+          </w:tcPr>
+          <w:p>
+            <w:r>
+              <w:rPr>
+                <w:sz w:val="20"/>
+                <w:szCs w:val="20"/>
+              </w:rPr>
+              <w:t xml:space="preserve"> </w:t>
+            </w:r>
+          </w:p>
+        </w:tc>
+      </w:tr>
+    </w:tbl>
+    <w:p>
+      <w:pPr>
+        <w:spacing w:before="500"/>
+      </w:pPr>
+      <w:r>
+        <w:rPr>
+          <w:b/>
+          <w:bCs/>
+          <w:sz w:val="22"/>
+          <w:szCs w:val="22"/>
+        </w:rPr>
+        <w:t xml:space="preserve">Signature of the PMC In-charge				</w:t>
+      </w:r>
+      <w:r>
+        <w:rPr>
+          <w:b/>
+          <w:bCs/>
+          <w:sz w:val="22"/>
+          <w:szCs w:val="22"/>
+        </w:rPr>
+        <w:t xml:space="preserve">Signature of the PMC Member</w:t>
+      </w:r>
+    </w:p>
+    <w:p>
+      <w:pPr>
+        <w:sectPr>
+          <w:pgSz w:w="12240" w:h="15840" w:orient="portrait"/>
+          <w:pgMar w:top="900" w:right="1000" w:bottom="900" w:left="1000" w:header="708" w:footer="708" w:gutter="0"/>
+          <w:pgNumType/>
+          <w:docGrid w:linePitch="360"/>
+        </w:sectPr>
+      </w:pPr>
+    </w:p>
     <w:p>
       <w:pPr>
         <w:spacing w:after="200"/>

</xml_diff>

<commit_message>
Fix guide name/designation alignment on the cover sheet
The guide's name, designation and institution were printed below
the "Signature of the Guide / Guide Name and Designation" label
line using an eyeballed tab/indent, which didn't line up with the
label text and put the block in the wrong order versus the First
Review Report's own cover page (there, the filled guide details sit
above the label line). Rebuilt as a borderless two-row table so both
rows share exact column positions, matching the First Review layout.

Co-Authored-By: Claude Sonnet 5 <noreply@anthropic.com>
Claude-Session: https://claude.ai/code/session_01NtKqrpTuv6riB3qBRrfQW7
</commit_message>
<xml_diff>
--- a/Second-Review-Report.docx
+++ b/Second-Review-Report.docx
@@ -503,52 +503,133 @@
         <w:t xml:space="preserve">Automated AI-Driven Loan Underwriting &amp; Document Fraud Detection System</w:t>
       </w:r>
     </w:p>
-    <w:p>
-      <w:pPr>
-        <w:spacing w:after="100" w:before="400"/>
-      </w:pPr>
-      <w:r>
-        <w:rPr>
-          <w:i/>
-          <w:iCs/>
-          <w:sz w:val="22"/>
-          <w:szCs w:val="22"/>
-        </w:rPr>
-        <w:t xml:space="preserve">Signature of the Guide:				</w:t>
-      </w:r>
-      <w:r>
-        <w:rPr>
-          <w:sz w:val="22"/>
-          <w:szCs w:val="22"/>
-        </w:rPr>
-        <w:t xml:space="preserve">Guide Name and Designation: Institution:</w:t>
-      </w:r>
-    </w:p>
-    <w:p>
-      <w:pPr>
-        <w:spacing w:after="200" w:before="60"/>
-        <w:ind w:left="4752"/>
-      </w:pPr>
-      <w:r>
-        <w:rPr>
-          <w:sz w:val="21"/>
-          <w:szCs w:val="21"/>
-        </w:rPr>
-        <w:t xml:space="preserve">Dr. R. Baskaran, Professor</w:t>
-      </w:r>
-    </w:p>
-    <w:p>
-      <w:pPr>
-        <w:ind w:left="4752"/>
-      </w:pPr>
-      <w:r>
-        <w:rPr>
-          <w:sz w:val="21"/>
-          <w:szCs w:val="21"/>
-        </w:rPr>
-        <w:t xml:space="preserve">Dept. of CSE, CEG Campus, Anna University, Chennai - 25</w:t>
-      </w:r>
-    </w:p>
+    <w:tbl>
+      <w:tblPr>
+        <w:tblW w:type="dxa" w:w="10240"/>
+        <w:tblBorders>
+          <w:top w:val="none" w:color="FFFFFF" w:sz="0"/>
+          <w:left w:val="none" w:color="FFFFFF" w:sz="0"/>
+          <w:bottom w:val="none" w:color="FFFFFF" w:sz="0"/>
+          <w:right w:val="none" w:color="FFFFFF" w:sz="0"/>
+          <w:insideH w:val="none" w:color="FFFFFF" w:sz="0"/>
+          <w:insideV w:val="none" w:color="FFFFFF" w:sz="0"/>
+        </w:tblBorders>
+      </w:tblPr>
+      <w:tblGrid>
+        <w:gridCol w:w="3000"/>
+        <w:gridCol w:w="7240"/>
+      </w:tblGrid>
+      <w:tr>
+        <w:tc>
+          <w:tcPr>
+            <w:tcW w:type="dxa" w:w="3000"/>
+            <w:tcMar>
+              <w:top w:type="dxa" w:w="40"/>
+              <w:left w:type="dxa" w:w="0"/>
+              <w:bottom w:type="dxa" w:w="0"/>
+              <w:right w:type="dxa" w:w="0"/>
+            </w:tcMar>
+          </w:tcPr>
+          <w:p>
+            <w:r>
+              <w:rPr>
+                <w:sz w:val="22"/>
+                <w:szCs w:val="22"/>
+              </w:rPr>
+              <w:t xml:space="preserve"/>
+            </w:r>
+          </w:p>
+        </w:tc>
+        <w:tc>
+          <w:tcPr>
+            <w:tcW w:type="dxa" w:w="7240"/>
+            <w:tcMar>
+              <w:top w:type="dxa" w:w="40"/>
+              <w:left w:type="dxa" w:w="100"/>
+              <w:bottom w:type="dxa" w:w="0"/>
+              <w:right w:type="dxa" w:w="0"/>
+            </w:tcMar>
+          </w:tcPr>
+          <w:p>
+            <w:pPr>
+              <w:spacing w:after="20"/>
+            </w:pPr>
+            <w:r>
+              <w:rPr>
+                <w:sz w:val="21"/>
+                <w:szCs w:val="21"/>
+              </w:rPr>
+              <w:t xml:space="preserve">Dr. R. Baskaran, Professor</w:t>
+            </w:r>
+          </w:p>
+          <w:p>
+            <w:pPr>
+              <w:spacing w:after="20"/>
+            </w:pPr>
+            <w:r>
+              <w:rPr>
+                <w:sz w:val="21"/>
+                <w:szCs w:val="21"/>
+              </w:rPr>
+              <w:t xml:space="preserve">Department of Computer Science and Engineering, CEG Campus</w:t>
+            </w:r>
+          </w:p>
+          <w:p>
+            <w:r>
+              <w:rPr>
+                <w:sz w:val="21"/>
+                <w:szCs w:val="21"/>
+              </w:rPr>
+              <w:t xml:space="preserve">Anna University, Chennai - 25</w:t>
+            </w:r>
+          </w:p>
+        </w:tc>
+      </w:tr>
+      <w:tr>
+        <w:tc>
+          <w:tcPr>
+            <w:tcW w:type="dxa" w:w="3000"/>
+            <w:tcMar>
+              <w:top w:type="dxa" w:w="160"/>
+              <w:left w:type="dxa" w:w="0"/>
+              <w:bottom w:type="dxa" w:w="100"/>
+              <w:right w:type="dxa" w:w="0"/>
+            </w:tcMar>
+          </w:tcPr>
+          <w:p>
+            <w:r>
+              <w:rPr>
+                <w:i/>
+                <w:iCs/>
+                <w:sz w:val="22"/>
+                <w:szCs w:val="22"/>
+              </w:rPr>
+              <w:t xml:space="preserve">Signature of the Guide:</w:t>
+            </w:r>
+          </w:p>
+        </w:tc>
+        <w:tc>
+          <w:tcPr>
+            <w:tcW w:type="dxa" w:w="7240"/>
+            <w:tcMar>
+              <w:top w:type="dxa" w:w="160"/>
+              <w:left w:type="dxa" w:w="100"/>
+              <w:bottom w:type="dxa" w:w="100"/>
+              <w:right w:type="dxa" w:w="0"/>
+            </w:tcMar>
+          </w:tcPr>
+          <w:p>
+            <w:r>
+              <w:rPr>
+                <w:sz w:val="22"/>
+                <w:szCs w:val="22"/>
+              </w:rPr>
+              <w:t xml:space="preserve">Guide Name and Designation: Institution:</w:t>
+            </w:r>
+          </w:p>
+        </w:tc>
+      </w:tr>
+    </w:tbl>
     <w:p>
       <w:pPr>
         <w:pBdr>

</xml_diff>

<commit_message>
Remove table-grid artifact from the guide block on the cover sheet
The borderless table used to align the guide's name/designation
rendered a faint gridline guide in Word's editor view, which the
original form never has since it's built from plain paragraphs, not
a table. Replaced it with plain paragraphs using a real tab stop, so
there's no table object at all - matching the First Review Report's
own cover page exactly, with the same alignment guaranteed by the
tab stop instead of a table column.

Co-Authored-By: Claude Sonnet 5 <noreply@anthropic.com>
Claude-Session: https://claude.ai/code/session_01NtKqrpTuv6riB3qBRrfQW7
</commit_message>
<xml_diff>
--- a/Second-Review-Report.docx
+++ b/Second-Review-Report.docx
@@ -503,133 +503,75 @@
         <w:t xml:space="preserve">Automated AI-Driven Loan Underwriting &amp; Document Fraud Detection System</w:t>
       </w:r>
     </w:p>
-    <w:tbl>
-      <w:tblPr>
-        <w:tblW w:type="dxa" w:w="10240"/>
-        <w:tblBorders>
-          <w:top w:val="none" w:color="FFFFFF" w:sz="0"/>
-          <w:left w:val="none" w:color="FFFFFF" w:sz="0"/>
-          <w:bottom w:val="none" w:color="FFFFFF" w:sz="0"/>
-          <w:right w:val="none" w:color="FFFFFF" w:sz="0"/>
-          <w:insideH w:val="none" w:color="FFFFFF" w:sz="0"/>
-          <w:insideV w:val="none" w:color="FFFFFF" w:sz="0"/>
-        </w:tblBorders>
-      </w:tblPr>
-      <w:tblGrid>
-        <w:gridCol w:w="3000"/>
-        <w:gridCol w:w="7240"/>
-      </w:tblGrid>
-      <w:tr>
-        <w:tc>
-          <w:tcPr>
-            <w:tcW w:type="dxa" w:w="3000"/>
-            <w:tcMar>
-              <w:top w:type="dxa" w:w="40"/>
-              <w:left w:type="dxa" w:w="0"/>
-              <w:bottom w:type="dxa" w:w="0"/>
-              <w:right w:type="dxa" w:w="0"/>
-            </w:tcMar>
-          </w:tcPr>
-          <w:p>
-            <w:r>
-              <w:rPr>
-                <w:sz w:val="22"/>
-                <w:szCs w:val="22"/>
-              </w:rPr>
-              <w:t xml:space="preserve"/>
-            </w:r>
-          </w:p>
-        </w:tc>
-        <w:tc>
-          <w:tcPr>
-            <w:tcW w:type="dxa" w:w="7240"/>
-            <w:tcMar>
-              <w:top w:type="dxa" w:w="40"/>
-              <w:left w:type="dxa" w:w="100"/>
-              <w:bottom w:type="dxa" w:w="0"/>
-              <w:right w:type="dxa" w:w="0"/>
-            </w:tcMar>
-          </w:tcPr>
-          <w:p>
-            <w:pPr>
-              <w:spacing w:after="20"/>
-            </w:pPr>
-            <w:r>
-              <w:rPr>
-                <w:sz w:val="21"/>
-                <w:szCs w:val="21"/>
-              </w:rPr>
-              <w:t xml:space="preserve">Dr. R. Baskaran, Professor</w:t>
-            </w:r>
-          </w:p>
-          <w:p>
-            <w:pPr>
-              <w:spacing w:after="20"/>
-            </w:pPr>
-            <w:r>
-              <w:rPr>
-                <w:sz w:val="21"/>
-                <w:szCs w:val="21"/>
-              </w:rPr>
-              <w:t xml:space="preserve">Department of Computer Science and Engineering, CEG Campus</w:t>
-            </w:r>
-          </w:p>
-          <w:p>
-            <w:r>
-              <w:rPr>
-                <w:sz w:val="21"/>
-                <w:szCs w:val="21"/>
-              </w:rPr>
-              <w:t xml:space="preserve">Anna University, Chennai - 25</w:t>
-            </w:r>
-          </w:p>
-        </w:tc>
-      </w:tr>
-      <w:tr>
-        <w:tc>
-          <w:tcPr>
-            <w:tcW w:type="dxa" w:w="3000"/>
-            <w:tcMar>
-              <w:top w:type="dxa" w:w="160"/>
-              <w:left w:type="dxa" w:w="0"/>
-              <w:bottom w:type="dxa" w:w="100"/>
-              <w:right w:type="dxa" w:w="0"/>
-            </w:tcMar>
-          </w:tcPr>
-          <w:p>
-            <w:r>
-              <w:rPr>
-                <w:i/>
-                <w:iCs/>
-                <w:sz w:val="22"/>
-                <w:szCs w:val="22"/>
-              </w:rPr>
-              <w:t xml:space="preserve">Signature of the Guide:</w:t>
-            </w:r>
-          </w:p>
-        </w:tc>
-        <w:tc>
-          <w:tcPr>
-            <w:tcW w:type="dxa" w:w="7240"/>
-            <w:tcMar>
-              <w:top w:type="dxa" w:w="160"/>
-              <w:left w:type="dxa" w:w="100"/>
-              <w:bottom w:type="dxa" w:w="100"/>
-              <w:right w:type="dxa" w:w="0"/>
-            </w:tcMar>
-          </w:tcPr>
-          <w:p>
-            <w:r>
-              <w:rPr>
-                <w:sz w:val="22"/>
-                <w:szCs w:val="22"/>
-              </w:rPr>
-              <w:t xml:space="preserve">Guide Name and Designation: Institution:</w:t>
-            </w:r>
-          </w:p>
-        </w:tc>
-      </w:tr>
-    </w:tbl>
+    <w:p>
+      <w:pPr>
+        <w:tabs>
+          <w:tab w:val="left" w:pos="4464"/>
+        </w:tabs>
+        <w:spacing w:after="20" w:before="240"/>
+      </w:pPr>
+      <w:r>
+        <w:rPr>
+          <w:sz w:val="21"/>
+          <w:szCs w:val="21"/>
+        </w:rPr>
+        <w:t xml:space="preserve">	Dr. R. Baskaran, Professor</w:t>
+      </w:r>
+    </w:p>
+    <w:p>
+      <w:pPr>
+        <w:tabs>
+          <w:tab w:val="left" w:pos="4464"/>
+        </w:tabs>
+        <w:spacing w:after="20"/>
+      </w:pPr>
+      <w:r>
+        <w:rPr>
+          <w:sz w:val="21"/>
+          <w:szCs w:val="21"/>
+        </w:rPr>
+        <w:t xml:space="preserve">	Department of Computer Science and Engineering, CEG Campus</w:t>
+      </w:r>
+    </w:p>
+    <w:p>
+      <w:pPr>
+        <w:tabs>
+          <w:tab w:val="left" w:pos="4464"/>
+        </w:tabs>
+        <w:spacing w:after="200"/>
+      </w:pPr>
+      <w:r>
+        <w:rPr>
+          <w:sz w:val="21"/>
+          <w:szCs w:val="21"/>
+        </w:rPr>
+        <w:t xml:space="preserve">	Anna University, Chennai - 25</w:t>
+      </w:r>
+    </w:p>
+    <w:p>
+      <w:pPr>
+        <w:tabs>
+          <w:tab w:val="left" w:pos="4464"/>
+        </w:tabs>
+        <w:spacing w:after="240"/>
+      </w:pPr>
+      <w:r>
+        <w:rPr>
+          <w:i/>
+          <w:iCs/>
+          <w:sz w:val="22"/>
+          <w:szCs w:val="22"/>
+        </w:rPr>
+        <w:t xml:space="preserve">Signature of the Guide:</w:t>
+      </w:r>
+      <w:r>
+        <w:rPr>
+          <w:sz w:val="22"/>
+          <w:szCs w:val="22"/>
+        </w:rPr>
+        <w:t xml:space="preserve">	Guide Name and Designation: Institution:</w:t>
+      </w:r>
+    </w:p>
     <w:p>
       <w:pPr>
         <w:pBdr>

</xml_diff>